<commit_message>
Site: add Experience section (recent work, anonymized per NDAs); CV: add Recent Experience
Co-Authored-By: Claude Opus 5.5 <noreply@anthropic.com>
</commit_message>
<xml_diff>
--- a/Benjy-Alper-CV.docx
+++ b/Benjy-Alper-CV.docx
@@ -135,6 +135,223 @@
             <w:r>
               <w:t>Born and raised bilingually, I combine linguistic precision with sensitivity to voice, register, and cultural nuance. I work with law firms, hospitals, startups, publishers, and individual clients, and I approach each project with equal rigor and care.</w:t>
             </w:r>
+          </w:p>
+          <w:tbl>
+            <w:tblPr>
+              <w:tblW w:w="0" w:type="auto"/>
+              <w:tblLook w:val="04A0" w:firstRow="1" w:lastRow="0" w:firstColumn="1" w:lastColumn="0" w:noHBand="0" w:noVBand="1"/>
+            </w:tblPr>
+            <w:tblGrid>
+              <w:gridCol w:w="5270"/>
+            </w:tblGrid>
+            <w:tr>
+              <w:tc>
+                <w:tcPr>
+                  <w:tcW w:w="5270" w:type="dxa"/>
+                  <w:tcBorders>
+                    <w:top w:val="nil"/>
+                    <w:left w:val="nil"/>
+                    <w:bottom w:val="nil"/>
+                    <w:right w:val="nil"/>
+                  </w:tcBorders>
+                  <w:shd w:val="clear" w:color="auto" w:fill="1F4E79"/>
+                </w:tcPr>
+                <w:p>
+                  <w:pPr>
+                    <w:pStyle w:val="SectionHead"/>
+                  </w:pPr>
+                  <w:r>
+                    <w:t xml:space="preserve">  Recent Experience</w:t>
+                  </w:r>
+                </w:p>
+              </w:tc>
+            </w:tr>
+          </w:tbl>
+          <w:p/>
+          <w:p>
+            <w:pPr>
+              <w:spacing w:after="20"/>
+            </w:pPr>
+          </w:p>
+          <w:p>
+            <w:pPr>
+              <w:pStyle w:val="Bullet"/>
+              <w:ind w:left="142" w:hanging="102"/>
+            </w:pPr>
+            <w:r>
+              <w:rPr>
+                <w:b/>
+              </w:rPr>
+              <w:t xml:space="preserve">• Hebrew Localization Linguist, global social-media platform</w:t>
+            </w:r>
+            <w:r>
+              <w:t xml:space="preserve"> | International language-services provider, 2026–present</w:t>
+            </w:r>
+          </w:p>
+          <w:p>
+            <w:pPr>
+              <w:pStyle w:val="Bullet"/>
+              <w:spacing w:after="80"/>
+              <w:ind w:left="244"/>
+            </w:pPr>
+            <w:r>
+              <w:t xml:space="preserve">Daily post-editing, proofreading and translation (EN→HE) of app strings, help-center articles and marketing copy under the client style guide and term base; monthly AI-check QA reports, LQA reviews, LLM machine-translation model comparisons, linguist consultation on product wording.</w:t>
+            </w:r>
+          </w:p>
+          <w:p>
+            <w:pPr>
+              <w:pStyle w:val="Bullet"/>
+              <w:ind w:left="142" w:hanging="102"/>
+            </w:pPr>
+            <w:r>
+              <w:rPr>
+                <w:b/>
+              </w:rPr>
+              <w:t xml:space="preserve">• Editor &amp; LQA Reviewer, global cybersecurity brand</w:t>
+            </w:r>
+            <w:r>
+              <w:t xml:space="preserve"> | International translation agency, 2026–present</w:t>
+            </w:r>
+          </w:p>
+          <w:p>
+            <w:pPr>
+              <w:pStyle w:val="Bullet"/>
+              <w:spacing w:after="80"/>
+              <w:ind w:left="244"/>
+            </w:pPr>
+            <w:r>
+              <w:t xml:space="preserve">Crowdin editing of VPN and security product web pages under strict brand and legal wording rules; the client's quarterly language-quality panel (LQI error scoring, translator feedback); LQA evaluations of security and password-manager marketing texts.</w:t>
+            </w:r>
+          </w:p>
+          <w:p>
+            <w:pPr>
+              <w:pStyle w:val="Bullet"/>
+              <w:ind w:left="142" w:hanging="102"/>
+            </w:pPr>
+            <w:r>
+              <w:rPr>
+                <w:b/>
+              </w:rPr>
+              <w:t xml:space="preserve">• Medical Editor, leading US children's hospital</w:t>
+            </w:r>
+            <w:r>
+              <w:t xml:space="preserve"> | International translation agency, 2026–present</w:t>
+            </w:r>
+          </w:p>
+          <w:p>
+            <w:pPr>
+              <w:pStyle w:val="Bullet"/>
+              <w:spacing w:after="80"/>
+              <w:ind w:left="244"/>
+            </w:pPr>
+            <w:r>
+              <w:t xml:space="preserve">Editing EN→HE patient materials (After Visit Summaries) in memoQ, following the hospital's style guide, checklist and patient-data procedures.</w:t>
+            </w:r>
+          </w:p>
+          <w:p>
+            <w:pPr>
+              <w:pStyle w:val="Bullet"/>
+              <w:ind w:left="142" w:hanging="102"/>
+            </w:pPr>
+            <w:r>
+              <w:rPr>
+                <w:b/>
+              </w:rPr>
+              <w:t xml:space="preserve">• Technical Translator &amp; MTPE Editor, LGMG, Dreame, TEXA</w:t>
+            </w:r>
+            <w:r>
+              <w:t xml:space="preserve"> | GEL (Good Enterprise Limited), 2021–present</w:t>
+            </w:r>
+          </w:p>
+          <w:p>
+            <w:pPr>
+              <w:pStyle w:val="Bullet"/>
+              <w:spacing w:after="80"/>
+              <w:ind w:left="244"/>
+            </w:pPr>
+            <w:r>
+              <w:t xml:space="preserve">Operator and service manuals for aerial work platforms, robot vacuums and automotive diagnostics; large multi-file MTPE projects in YiCAT and Trados; terminology consistency and translation-memory revision lists.</w:t>
+            </w:r>
+          </w:p>
+          <w:p>
+            <w:pPr>
+              <w:pStyle w:val="Bullet"/>
+              <w:ind w:left="142" w:hanging="102"/>
+            </w:pPr>
+            <w:r>
+              <w:rPr>
+                <w:b/>
+              </w:rPr>
+              <w:t xml:space="preserve">• Manga Translator, official Hebrew edition</w:t>
+            </w:r>
+            <w:r>
+              <w:t xml:space="preserve"> | International comics localization agency, 2026–present</w:t>
+            </w:r>
+          </w:p>
+          <w:p>
+            <w:pPr>
+              <w:pStyle w:val="Bullet"/>
+              <w:spacing w:after="80"/>
+              <w:ind w:left="244"/>
+            </w:pPr>
+            <w:r>
+              <w:t xml:space="preserve">Hebrew translation of a long-running Japanese manga series for official release: dialogue, sound effects and a maintained series glossary.</w:t>
+            </w:r>
+          </w:p>
+          <w:p>
+            <w:pPr>
+              <w:pStyle w:val="Bullet"/>
+              <w:ind w:left="142" w:hanging="102"/>
+            </w:pPr>
+            <w:r>
+              <w:rPr>
+                <w:b/>
+              </w:rPr>
+              <w:t xml:space="preserve">• Translator &amp; Subtitler</w:t>
+            </w:r>
+            <w:r>
+              <w:t xml:space="preserve"> | UK/US marketing localization agency, 2026–present</w:t>
+            </w:r>
+          </w:p>
+          <w:p>
+            <w:pPr>
+              <w:pStyle w:val="Bullet"/>
+              <w:spacing w:after="80"/>
+              <w:ind w:left="244"/>
+            </w:pPr>
+            <w:r>
+              <w:t xml:space="preserve">Subtitle translation and review for theatrical film trailers under high-security protocols; HR-software content for an enterprise client.</w:t>
+            </w:r>
+          </w:p>
+          <w:p>
+            <w:pPr>
+              <w:pStyle w:val="Bullet"/>
+              <w:ind w:left="142" w:hanging="102"/>
+            </w:pPr>
+            <w:r>
+              <w:rPr>
+                <w:b/>
+              </w:rPr>
+              <w:t xml:space="preserve">• Audio projects</w:t>
+            </w:r>
+            <w:r>
+              <w:t xml:space="preserve"> | Mission Translate, Ulatus, 2021–present</w:t>
+            </w:r>
+          </w:p>
+          <w:p>
+            <w:pPr>
+              <w:pStyle w:val="Bullet"/>
+              <w:spacing w:after="80"/>
+              <w:ind w:left="244"/>
+            </w:pPr>
+            <w:r>
+              <w:t xml:space="preserve">Hebrew→English transcription and translation of audio files; Hebrew voice recordings for a speech-data project.</w:t>
+            </w:r>
+          </w:p>
+          <w:p>
+            <w:pPr>
+              <w:spacing w:after="80"/>
+            </w:pPr>
           </w:p>
           <w:tbl>
             <w:tblPr>
@@ -438,7 +655,7 @@
               <w:ind w:left="125" w:hanging="102"/>
             </w:pPr>
             <w:r>
-              <w:t>• memoQ</w:t>
+              <w:t>• memoQ, Crowdin, YiCAT, Xbench</w:t>
             </w:r>
           </w:p>
           <w:p>

</xml_diff>